<commit_message>
Merge experience sections in Terry resume into one
</commit_message>
<xml_diff>
--- a/Sukwoo_Chung_Resume_Terry.docx
+++ b/Sukwoo_Chung_Resume_Terry.docx
@@ -331,7 +331,7 @@
           <w:sz w:val="20"/>
           <w:szCs w:val="20"/>
         </w:rPr>
-        <w:t xml:space="preserve">Seoul, Korea</w:t>
+        <w:t xml:space="preserve">Seoul, Korea / Manila, Philippines</w:t>
       </w:r>
     </w:p>
     <w:p>
@@ -419,7 +419,7 @@
           <w:sz w:val="20"/>
           <w:szCs w:val="20"/>
         </w:rPr>
-        <w:t xml:space="preserve">Revenue Management &amp; Pricing Systems Manager</w:t>
+        <w:t xml:space="preserve">Regional Sales Marketing Manager, Philippines Regional Office</w:t>
       </w:r>
       <w:r>
         <w:rPr>
@@ -435,43 +435,43 @@
           <w:sz w:val="20"/>
           <w:szCs w:val="20"/>
         </w:rPr>
-        <w:t xml:space="preserve">April 2021 – September 2022</w:t>
-      </w:r>
-    </w:p>
-    <w:p>
-      <w:pPr>
-        <w:pStyle w:val="ListParagraph"/>
-        <w:numPr>
-          <w:ilvl w:val="0"/>
-          <w:numId w:val="2"/>
-        </w:numPr>
-        <w:spacing w:after="0"/>
-      </w:pPr>
-      <w:r>
-        <w:rPr>
-          <w:rFonts w:ascii="Times New Roman" w:cs="Times New Roman" w:eastAsia="Times New Roman" w:hAnsi="Times New Roman"/>
-          <w:sz w:val="20"/>
-          <w:szCs w:val="20"/>
-        </w:rPr>
-        <w:t xml:space="preserve">Implemented logistic regression and random forest models in Python to analyze COVID-19 route recovery and inform forecasting and pricing</w:t>
-      </w:r>
-    </w:p>
-    <w:p>
-      <w:pPr>
-        <w:pStyle w:val="ListParagraph"/>
-        <w:numPr>
-          <w:ilvl w:val="0"/>
-          <w:numId w:val="2"/>
-        </w:numPr>
-        <w:spacing w:after="0"/>
-      </w:pPr>
-      <w:r>
-        <w:rPr>
-          <w:rFonts w:ascii="Times New Roman" w:cs="Times New Roman" w:eastAsia="Times New Roman" w:hAnsi="Times New Roman"/>
-          <w:sz w:val="20"/>
-          <w:szCs w:val="20"/>
-        </w:rPr>
-        <w:t xml:space="preserve">Evaluated Amadeus Revenue Management System (RMS) as an alternative during PROS contract renewal, contributing to $3.32M in 5-year cost savings; coached 4 junior colleagues</w:t>
+        <w:t xml:space="preserve">September 2022 – April 2023</w:t>
+      </w:r>
+    </w:p>
+    <w:p>
+      <w:pPr>
+        <w:pStyle w:val="ListParagraph"/>
+        <w:numPr>
+          <w:ilvl w:val="0"/>
+          <w:numId w:val="2"/>
+        </w:numPr>
+        <w:spacing w:after="0"/>
+      </w:pPr>
+      <w:r>
+        <w:rPr>
+          <w:rFonts w:ascii="Times New Roman" w:cs="Times New Roman" w:eastAsia="Times New Roman" w:hAnsi="Times New Roman"/>
+          <w:sz w:val="20"/>
+          <w:szCs w:val="20"/>
+        </w:rPr>
+        <w:t xml:space="preserve">Directed a 7-person sales team across Manila, Cebu, and Guam, increasing group reservations +340% year-over-year (YoY) and restoring 80% of 2019 pre-COVID-19 volume</w:t>
+      </w:r>
+    </w:p>
+    <w:p>
+      <w:pPr>
+        <w:pStyle w:val="ListParagraph"/>
+        <w:numPr>
+          <w:ilvl w:val="0"/>
+          <w:numId w:val="2"/>
+        </w:numPr>
+        <w:spacing w:after="0"/>
+      </w:pPr>
+      <w:r>
+        <w:rPr>
+          <w:rFonts w:ascii="Times New Roman" w:cs="Times New Roman" w:eastAsia="Times New Roman" w:hAnsi="Times New Roman"/>
+          <w:sz w:val="20"/>
+          <w:szCs w:val="20"/>
+        </w:rPr>
+        <w:t xml:space="preserve">Executed 7 travel fairs with the Philippine Travel Agencies Association and Korea Tourism Organization ($2.1M revenue)</w:t>
       </w:r>
     </w:p>
     <w:p>
@@ -489,7 +489,7 @@
           <w:sz w:val="20"/>
           <w:szCs w:val="20"/>
         </w:rPr>
-        <w:t xml:space="preserve">Passenger Division Data Analyst &amp; System Administrator</w:t>
+        <w:t xml:space="preserve">Revenue Management &amp; Pricing Systems Manager</w:t>
       </w:r>
       <w:r>
         <w:rPr>
@@ -505,61 +505,43 @@
           <w:sz w:val="20"/>
           <w:szCs w:val="20"/>
         </w:rPr>
-        <w:t xml:space="preserve">January 2017 – April 2021</w:t>
-      </w:r>
-    </w:p>
-    <w:p>
-      <w:pPr>
-        <w:pStyle w:val="ListParagraph"/>
-        <w:numPr>
-          <w:ilvl w:val="0"/>
-          <w:numId w:val="2"/>
-        </w:numPr>
-        <w:spacing w:after="0"/>
-      </w:pPr>
-      <w:r>
-        <w:rPr>
-          <w:rFonts w:ascii="Times New Roman" w:cs="Times New Roman" w:eastAsia="Times New Roman" w:hAnsi="Times New Roman"/>
-          <w:sz w:val="20"/>
-          <w:szCs w:val="20"/>
-        </w:rPr>
-        <w:t xml:space="preserve">Integrated 100M+ ticketing and flown records with Delta Air Lines’ passenger data in 9 months, creating one shared dataset for both carriers</w:t>
-      </w:r>
-    </w:p>
-    <w:p>
-      <w:pPr>
-        <w:pStyle w:val="ListParagraph"/>
-        <w:numPr>
-          <w:ilvl w:val="0"/>
-          <w:numId w:val="2"/>
-        </w:numPr>
-        <w:spacing w:after="0"/>
-      </w:pPr>
-      <w:r>
-        <w:rPr>
-          <w:rFonts w:ascii="Times New Roman" w:cs="Times New Roman" w:eastAsia="Times New Roman" w:hAnsi="Times New Roman"/>
-          <w:sz w:val="20"/>
-          <w:szCs w:val="20"/>
-        </w:rPr>
-        <w:t xml:space="preserve">Renegotiated the International Air Transport Association (IATA) Direct Data Solutions (DDS) contract during COVID-19 ($390K savings); trained sales and planning teams in Korean and English through 74 hours of Data/Business Intelligence (BI) courses</w:t>
-      </w:r>
-    </w:p>
-    <w:p>
-      <w:pPr>
-        <w:pBdr>
-          <w:bottom w:val="single" w:color="000000" w:sz="6" w:space="0"/>
-        </w:pBdr>
-        <w:spacing w:after="20" w:before="110"/>
-      </w:pPr>
-      <w:r>
-        <w:rPr>
-          <w:rFonts w:ascii="Times New Roman" w:cs="Times New Roman" w:eastAsia="Times New Roman" w:hAnsi="Times New Roman"/>
-          <w:b/>
-          <w:bCs/>
-          <w:sz w:val="20"/>
-          <w:szCs w:val="20"/>
-        </w:rPr>
-        <w:t xml:space="preserve">ADDITIONAL EXPERIENCE</w:t>
+        <w:t xml:space="preserve">April 2021 – September 2022</w:t>
+      </w:r>
+    </w:p>
+    <w:p>
+      <w:pPr>
+        <w:pStyle w:val="ListParagraph"/>
+        <w:numPr>
+          <w:ilvl w:val="0"/>
+          <w:numId w:val="2"/>
+        </w:numPr>
+        <w:spacing w:after="0"/>
+      </w:pPr>
+      <w:r>
+        <w:rPr>
+          <w:rFonts w:ascii="Times New Roman" w:cs="Times New Roman" w:eastAsia="Times New Roman" w:hAnsi="Times New Roman"/>
+          <w:sz w:val="20"/>
+          <w:szCs w:val="20"/>
+        </w:rPr>
+        <w:t xml:space="preserve">Implemented logistic regression and random forest models in Python to analyze COVID-19 route recovery and inform forecasting and pricing</w:t>
+      </w:r>
+    </w:p>
+    <w:p>
+      <w:pPr>
+        <w:pStyle w:val="ListParagraph"/>
+        <w:numPr>
+          <w:ilvl w:val="0"/>
+          <w:numId w:val="2"/>
+        </w:numPr>
+        <w:spacing w:after="0"/>
+      </w:pPr>
+      <w:r>
+        <w:rPr>
+          <w:rFonts w:ascii="Times New Roman" w:cs="Times New Roman" w:eastAsia="Times New Roman" w:hAnsi="Times New Roman"/>
+          <w:sz w:val="20"/>
+          <w:szCs w:val="20"/>
+        </w:rPr>
+        <w:t xml:space="preserve">Evaluated Amadeus Revenue Management System (RMS) as an alternative during PROS contract renewal, contributing to $3.32M in 5-year cost savings; coached 4 junior colleagues</w:t>
       </w:r>
     </w:p>
     <w:p>
@@ -567,17 +549,17 @@
         <w:tabs>
           <w:tab w:val="right" w:pos="10800"/>
         </w:tabs>
-        <w:spacing w:after="0" w:before="0"/>
-      </w:pPr>
-      <w:r>
-        <w:rPr>
-          <w:rFonts w:ascii="Times New Roman" w:cs="Times New Roman" w:eastAsia="Times New Roman" w:hAnsi="Times New Roman"/>
-          <w:b/>
-          <w:bCs/>
-          <w:sz w:val="20"/>
-          <w:szCs w:val="20"/>
-        </w:rPr>
-        <w:t xml:space="preserve">Korean Air</w:t>
+        <w:spacing w:after="0" w:before="40"/>
+      </w:pPr>
+      <w:r>
+        <w:rPr>
+          <w:rFonts w:ascii="Times New Roman" w:cs="Times New Roman" w:eastAsia="Times New Roman" w:hAnsi="Times New Roman"/>
+          <w:i/>
+          <w:iCs/>
+          <w:sz w:val="20"/>
+          <w:szCs w:val="20"/>
+        </w:rPr>
+        <w:t xml:space="preserve">Passenger Division Data Analyst &amp; System Administrator</w:t>
       </w:r>
       <w:r>
         <w:rPr>
@@ -593,7 +575,43 @@
           <w:sz w:val="20"/>
           <w:szCs w:val="20"/>
         </w:rPr>
-        <w:t xml:space="preserve">Manila, Philippines</w:t>
+        <w:t xml:space="preserve">January 2017 – April 2021</w:t>
+      </w:r>
+    </w:p>
+    <w:p>
+      <w:pPr>
+        <w:pStyle w:val="ListParagraph"/>
+        <w:numPr>
+          <w:ilvl w:val="0"/>
+          <w:numId w:val="2"/>
+        </w:numPr>
+        <w:spacing w:after="0"/>
+      </w:pPr>
+      <w:r>
+        <w:rPr>
+          <w:rFonts w:ascii="Times New Roman" w:cs="Times New Roman" w:eastAsia="Times New Roman" w:hAnsi="Times New Roman"/>
+          <w:sz w:val="20"/>
+          <w:szCs w:val="20"/>
+        </w:rPr>
+        <w:t xml:space="preserve">Integrated 100M+ ticketing and flown records with Delta Air Lines’ passenger data in 9 months, creating one shared dataset for both carriers</w:t>
+      </w:r>
+    </w:p>
+    <w:p>
+      <w:pPr>
+        <w:pStyle w:val="ListParagraph"/>
+        <w:numPr>
+          <w:ilvl w:val="0"/>
+          <w:numId w:val="2"/>
+        </w:numPr>
+        <w:spacing w:after="0"/>
+      </w:pPr>
+      <w:r>
+        <w:rPr>
+          <w:rFonts w:ascii="Times New Roman" w:cs="Times New Roman" w:eastAsia="Times New Roman" w:hAnsi="Times New Roman"/>
+          <w:sz w:val="20"/>
+          <w:szCs w:val="20"/>
+        </w:rPr>
+        <w:t xml:space="preserve">Renegotiated the International Air Transport Association (IATA) Direct Data Solutions (DDS) contract during COVID-19 ($390K savings); trained sales and planning teams in Korean and English through 74 hours of Data/Business Intelligence (BI) courses</w:t>
       </w:r>
     </w:p>
     <w:p>
@@ -601,111 +619,7 @@
         <w:tabs>
           <w:tab w:val="right" w:pos="10800"/>
         </w:tabs>
-        <w:spacing w:after="0" w:before="0"/>
-      </w:pPr>
-      <w:r>
-        <w:rPr>
-          <w:rFonts w:ascii="Times New Roman" w:cs="Times New Roman" w:eastAsia="Times New Roman" w:hAnsi="Times New Roman"/>
-          <w:i/>
-          <w:iCs/>
-          <w:sz w:val="20"/>
-          <w:szCs w:val="20"/>
-        </w:rPr>
-        <w:t xml:space="preserve">Regional Sales Marketing Manager, Philippines Regional Office</w:t>
-      </w:r>
-      <w:r>
-        <w:rPr>
-          <w:rFonts w:ascii="Times New Roman" w:cs="Times New Roman" w:eastAsia="Times New Roman" w:hAnsi="Times New Roman"/>
-          <w:sz w:val="20"/>
-          <w:szCs w:val="20"/>
-        </w:rPr>
-        <w:t xml:space="preserve">	</w:t>
-      </w:r>
-      <w:r>
-        <w:rPr>
-          <w:rFonts w:ascii="Times New Roman" w:cs="Times New Roman" w:eastAsia="Times New Roman" w:hAnsi="Times New Roman"/>
-          <w:sz w:val="20"/>
-          <w:szCs w:val="20"/>
-        </w:rPr>
-        <w:t xml:space="preserve">September 2022 – April 2023</w:t>
-      </w:r>
-    </w:p>
-    <w:p>
-      <w:pPr>
-        <w:pStyle w:val="ListParagraph"/>
-        <w:numPr>
-          <w:ilvl w:val="0"/>
-          <w:numId w:val="2"/>
-        </w:numPr>
-        <w:spacing w:after="0"/>
-      </w:pPr>
-      <w:r>
-        <w:rPr>
-          <w:rFonts w:ascii="Times New Roman" w:cs="Times New Roman" w:eastAsia="Times New Roman" w:hAnsi="Times New Roman"/>
-          <w:sz w:val="20"/>
-          <w:szCs w:val="20"/>
-        </w:rPr>
-        <w:t xml:space="preserve">Directed a 7-person sales team across Manila, Cebu, and Guam, increasing group reservations +340% year-over-year (YoY) and restoring 80% of 2019 pre-COVID-19 volume</w:t>
-      </w:r>
-    </w:p>
-    <w:p>
-      <w:pPr>
-        <w:pStyle w:val="ListParagraph"/>
-        <w:numPr>
-          <w:ilvl w:val="0"/>
-          <w:numId w:val="2"/>
-        </w:numPr>
-        <w:spacing w:after="0"/>
-      </w:pPr>
-      <w:r>
-        <w:rPr>
-          <w:rFonts w:ascii="Times New Roman" w:cs="Times New Roman" w:eastAsia="Times New Roman" w:hAnsi="Times New Roman"/>
-          <w:sz w:val="20"/>
-          <w:szCs w:val="20"/>
-        </w:rPr>
-        <w:t xml:space="preserve">Executed 7 travel fairs with the Philippine Travel Agencies Association and Korea Tourism Organization ($2.1M revenue)</w:t>
-      </w:r>
-    </w:p>
-    <w:p>
-      <w:pPr>
-        <w:tabs>
-          <w:tab w:val="right" w:pos="10800"/>
-        </w:tabs>
-        <w:spacing w:after="0" w:before="70"/>
-      </w:pPr>
-      <w:r>
-        <w:rPr>
-          <w:rFonts w:ascii="Times New Roman" w:cs="Times New Roman" w:eastAsia="Times New Roman" w:hAnsi="Times New Roman"/>
-          <w:b/>
-          <w:bCs/>
-          <w:sz w:val="20"/>
-          <w:szCs w:val="20"/>
-        </w:rPr>
-        <w:t xml:space="preserve">Korean Air</w:t>
-      </w:r>
-      <w:r>
-        <w:rPr>
-          <w:rFonts w:ascii="Times New Roman" w:cs="Times New Roman" w:eastAsia="Times New Roman" w:hAnsi="Times New Roman"/>
-          <w:sz w:val="20"/>
-          <w:szCs w:val="20"/>
-        </w:rPr>
-        <w:t xml:space="preserve">	</w:t>
-      </w:r>
-      <w:r>
-        <w:rPr>
-          <w:rFonts w:ascii="Times New Roman" w:cs="Times New Roman" w:eastAsia="Times New Roman" w:hAnsi="Times New Roman"/>
-          <w:sz w:val="20"/>
-          <w:szCs w:val="20"/>
-        </w:rPr>
-        <w:t xml:space="preserve">Seoul, Korea</w:t>
-      </w:r>
-    </w:p>
-    <w:p>
-      <w:pPr>
-        <w:tabs>
-          <w:tab w:val="right" w:pos="10800"/>
-        </w:tabs>
-        <w:spacing w:after="0" w:before="0"/>
+        <w:spacing w:after="0" w:before="40"/>
       </w:pPr>
       <w:r>
         <w:rPr>

</xml_diff>

<commit_message>
Add Honors and Awards section to Terry resume
</commit_message>
<xml_diff>
--- a/Sukwoo_Chung_Resume_Terry.docx
+++ b/Sukwoo_Chung_Resume_Terry.docx
@@ -401,7 +401,7 @@
           <w:sz w:val="20"/>
           <w:szCs w:val="20"/>
         </w:rPr>
-        <w:t xml:space="preserve">Built a reservation misuse monitoring tool, flagging 600+ cases and preventing ~$370K in annual revenue leakage; earned the Quarterly IT Excellence Project Award</w:t>
+        <w:t xml:space="preserve">Built a reservation misuse monitoring tool, flagging 600+ cases and preventing ~$370K in annual revenue leakage</w:t>
       </w:r>
     </w:p>
     <w:p>
@@ -963,6 +963,76 @@
           <w:szCs w:val="20"/>
         </w:rPr>
         <w:t xml:space="preserve">: Korean (Native), Japanese (Fluent), Chinese (Basic)</w:t>
+      </w:r>
+    </w:p>
+    <w:p>
+      <w:pPr>
+        <w:pBdr>
+          <w:bottom w:val="single" w:color="000000" w:sz="6" w:space="0"/>
+        </w:pBdr>
+        <w:spacing w:after="20" w:before="110"/>
+      </w:pPr>
+      <w:r>
+        <w:rPr>
+          <w:rFonts w:ascii="Times New Roman" w:cs="Times New Roman" w:eastAsia="Times New Roman" w:hAnsi="Times New Roman"/>
+          <w:b/>
+          <w:bCs/>
+          <w:sz w:val="20"/>
+          <w:szCs w:val="20"/>
+        </w:rPr>
+        <w:t xml:space="preserve">HONORS AND AWARDS</w:t>
+      </w:r>
+    </w:p>
+    <w:p>
+      <w:pPr>
+        <w:tabs>
+          <w:tab w:val="right" w:pos="10800"/>
+        </w:tabs>
+        <w:spacing w:after="0" w:before="0"/>
+      </w:pPr>
+      <w:r>
+        <w:rPr>
+          <w:rFonts w:ascii="Times New Roman" w:cs="Times New Roman" w:eastAsia="Times New Roman" w:hAnsi="Times New Roman"/>
+          <w:b/>
+          <w:bCs/>
+          <w:sz w:val="20"/>
+          <w:szCs w:val="20"/>
+        </w:rPr>
+        <w:t xml:space="preserve">Quarterly IT Excellence Project Award</w:t>
+      </w:r>
+      <w:r>
+        <w:rPr>
+          <w:rFonts w:ascii="Times New Roman" w:cs="Times New Roman" w:eastAsia="Times New Roman" w:hAnsi="Times New Roman"/>
+          <w:sz w:val="20"/>
+          <w:szCs w:val="20"/>
+        </w:rPr>
+        <w:t xml:space="preserve">, </w:t>
+      </w:r>
+      <w:r>
+        <w:rPr>
+          <w:rFonts w:ascii="Times New Roman" w:cs="Times New Roman" w:eastAsia="Times New Roman" w:hAnsi="Times New Roman"/>
+          <w:i/>
+          <w:iCs/>
+          <w:sz w:val="20"/>
+          <w:szCs w:val="20"/>
+        </w:rPr>
+        <w:t xml:space="preserve">Korean Air</w:t>
+      </w:r>
+      <w:r>
+        <w:rPr>
+          <w:rFonts w:ascii="Times New Roman" w:cs="Times New Roman" w:eastAsia="Times New Roman" w:hAnsi="Times New Roman"/>
+          <w:sz w:val="20"/>
+          <w:szCs w:val="20"/>
+        </w:rPr>
+        <w:t xml:space="preserve">	</w:t>
+      </w:r>
+      <w:r>
+        <w:rPr>
+          <w:rFonts w:ascii="Times New Roman" w:cs="Times New Roman" w:eastAsia="Times New Roman" w:hAnsi="Times New Roman"/>
+          <w:sz w:val="20"/>
+          <w:szCs w:val="20"/>
+        </w:rPr>
+        <w:t xml:space="preserve">Q2 2024</w:t>
       </w:r>
     </w:p>
     <w:sectPr>

</xml_diff>